<commit_message>
Fixed some PCB errors
</commit_message>
<xml_diff>
--- a/Purchasing/RFF/RFF - Quadruped Robot.docx
+++ b/Purchasing/RFF/RFF - Quadruped Robot.docx
@@ -9,6 +9,7 @@
         <w:rPr>
           <w:rFonts w:ascii="Times New Roman" w:hAnsi="Times New Roman" w:cs="Times New Roman"/>
           <w:color w:val="156082" w:themeColor="accent1"/>
+          <w:lang w:eastAsia="ja-JP"/>
         </w:rPr>
       </w:pPr>
       <w:r>
@@ -16,7 +17,44 @@
           <w:rFonts w:ascii="Times New Roman" w:hAnsi="Times New Roman" w:cs="Times New Roman"/>
           <w:color w:val="156082" w:themeColor="accent1"/>
         </w:rPr>
-        <w:t>Student-Led Quadruped Robotics Development Platform</w:t>
+        <w:t xml:space="preserve">Student-Led Quadruped Robotics </w:t>
+      </w:r>
+      <w:r>
+        <w:rPr>
+          <w:rFonts w:ascii="Times New Roman" w:hAnsi="Times New Roman" w:cs="Times New Roman"/>
+          <w:color w:val="156082" w:themeColor="accent1"/>
+        </w:rPr>
+        <w:t>Proposal</w:t>
+      </w:r>
+      <w:r>
+        <w:rPr>
+          <w:rFonts w:ascii="Times New Roman" w:hAnsi="Times New Roman" w:cs="Times New Roman"/>
+          <w:color w:val="156082" w:themeColor="accent1"/>
+        </w:rPr>
+        <w:t xml:space="preserve"> </w:t>
+      </w:r>
+      <w:proofErr w:type="gramStart"/>
+      <w:r>
+        <w:rPr>
+          <w:rFonts w:ascii="Times New Roman" w:hAnsi="Times New Roman" w:cs="Times New Roman"/>
+          <w:color w:val="156082" w:themeColor="accent1"/>
+        </w:rPr>
+        <w:t>For</w:t>
+      </w:r>
+      <w:proofErr w:type="gramEnd"/>
+      <w:r>
+        <w:rPr>
+          <w:rFonts w:ascii="Times New Roman" w:hAnsi="Times New Roman" w:cs="Times New Roman"/>
+          <w:color w:val="156082" w:themeColor="accent1"/>
+        </w:rPr>
+        <w:t xml:space="preserve"> Fund</w:t>
+      </w:r>
+      <w:r>
+        <w:rPr>
+          <w:rFonts w:ascii="Times New Roman" w:hAnsi="Times New Roman" w:cs="Times New Roman"/>
+          <w:color w:val="156082" w:themeColor="accent1"/>
+        </w:rPr>
+        <w:t>ing</w:t>
       </w:r>
     </w:p>
     <w:p>
@@ -185,33 +223,24 @@
           <w:rFonts w:ascii="Times New Roman" w:hAnsi="Times New Roman" w:cs="Times New Roman"/>
           <w:sz w:val="20"/>
           <w:szCs w:val="20"/>
-        </w:rPr>
-      </w:pPr>
-      <w:r>
-        <w:rPr>
-          <w:rFonts w:ascii="Times New Roman" w:hAnsi="Times New Roman" w:cs="Times New Roman"/>
-          <w:sz w:val="20"/>
-          <w:szCs w:val="20"/>
-        </w:rPr>
-        <w:t>The robot is designed around custom cycloidal drive actuators, dedicated Field-Orientated Control (FOC) motor driver boards, and a centralized embedded control architecture. The goal is to create a scalable robotics testbed capable of supporting locomotion research, motor control experimentation, and future autonomy integration.</w:t>
-      </w:r>
-    </w:p>
-    <w:p>
-      <w:pPr>
-        <w:spacing w:before="80" w:after="0"/>
-        <w:rPr>
-          <w:rFonts w:ascii="Times New Roman" w:hAnsi="Times New Roman" w:cs="Times New Roman"/>
-          <w:sz w:val="20"/>
-          <w:szCs w:val="20"/>
-        </w:rPr>
-      </w:pPr>
-      <w:r>
-        <w:rPr>
-          <w:rFonts w:ascii="Times New Roman" w:hAnsi="Times New Roman" w:cs="Times New Roman"/>
-          <w:sz w:val="20"/>
-          <w:szCs w:val="20"/>
-        </w:rPr>
-        <w:t>The initiative emphasizes execution, system integration, and hardware-level engineering while bridging academic theory with practical robotics development.</w:t>
+          <w:lang w:eastAsia="ja-JP"/>
+        </w:rPr>
+      </w:pPr>
+      <w:r>
+        <w:rPr>
+          <w:rFonts w:ascii="Times New Roman" w:hAnsi="Times New Roman" w:cs="Times New Roman"/>
+          <w:sz w:val="20"/>
+          <w:szCs w:val="20"/>
+        </w:rPr>
+        <w:t xml:space="preserve">We are looking for funding to finish the project. </w:t>
+      </w:r>
+      <w:r>
+        <w:rPr>
+          <w:rFonts w:ascii="Times New Roman" w:hAnsi="Times New Roman" w:cs="Times New Roman"/>
+          <w:sz w:val="20"/>
+          <w:szCs w:val="20"/>
+        </w:rPr>
+        <w:t>This project serves as a hands-on workforce development initiative, bringing academic theory and real-world engineering implementation. It emphasizes execution, system integration, and hardware-level engineering. These are all critical to our education and development as we get ready for internships and jobs.</w:t>
       </w:r>
     </w:p>
     <w:p>
@@ -238,569 +267,6 @@
           <w:sz w:val="28"/>
           <w:szCs w:val="28"/>
         </w:rPr>
-        <w:t>Technical Architecture Overview</w:t>
-      </w:r>
-    </w:p>
-    <w:p>
-      <w:pPr>
-        <w:spacing w:before="200" w:after="0"/>
-        <w:rPr>
-          <w:rFonts w:ascii="Times New Roman" w:hAnsi="Times New Roman" w:cs="Times New Roman"/>
-          <w:sz w:val="22"/>
-          <w:szCs w:val="22"/>
-        </w:rPr>
-      </w:pPr>
-      <w:r>
-        <w:rPr>
-          <w:rFonts w:ascii="Times New Roman" w:hAnsi="Times New Roman" w:cs="Times New Roman"/>
-          <w:sz w:val="22"/>
-          <w:szCs w:val="22"/>
-        </w:rPr>
-        <w:t>Mechanical System</w:t>
-      </w:r>
-    </w:p>
-    <w:p>
-      <w:pPr>
-        <w:pStyle w:val="ListParagraph"/>
-        <w:numPr>
-          <w:ilvl w:val="0"/>
-          <w:numId w:val="4"/>
-        </w:numPr>
-        <w:spacing w:after="0"/>
-        <w:rPr>
-          <w:rFonts w:ascii="Times New Roman" w:hAnsi="Times New Roman" w:cs="Times New Roman"/>
-          <w:sz w:val="20"/>
-          <w:szCs w:val="20"/>
-        </w:rPr>
-      </w:pPr>
-      <w:r>
-        <w:rPr>
-          <w:rFonts w:ascii="Times New Roman" w:hAnsi="Times New Roman" w:cs="Times New Roman"/>
-          <w:sz w:val="20"/>
-          <w:szCs w:val="20"/>
-        </w:rPr>
-        <w:t>12 experimental cycloidal actuators (17:1 reduction)</w:t>
-      </w:r>
-    </w:p>
-    <w:p>
-      <w:pPr>
-        <w:pStyle w:val="ListParagraph"/>
-        <w:numPr>
-          <w:ilvl w:val="0"/>
-          <w:numId w:val="4"/>
-        </w:numPr>
-        <w:spacing w:before="240" w:after="0"/>
-        <w:rPr>
-          <w:rFonts w:ascii="Times New Roman" w:hAnsi="Times New Roman" w:cs="Times New Roman"/>
-          <w:sz w:val="20"/>
-          <w:szCs w:val="20"/>
-        </w:rPr>
-      </w:pPr>
-      <w:r>
-        <w:rPr>
-          <w:rFonts w:ascii="Times New Roman" w:hAnsi="Times New Roman" w:cs="Times New Roman"/>
-          <w:sz w:val="20"/>
-          <w:szCs w:val="20"/>
-        </w:rPr>
-        <w:t>Modular leg assemblies</w:t>
-      </w:r>
-    </w:p>
-    <w:p>
-      <w:pPr>
-        <w:pStyle w:val="ListParagraph"/>
-        <w:numPr>
-          <w:ilvl w:val="0"/>
-          <w:numId w:val="4"/>
-        </w:numPr>
-        <w:spacing w:before="240" w:after="0"/>
-        <w:rPr>
-          <w:rFonts w:ascii="Times New Roman" w:hAnsi="Times New Roman" w:cs="Times New Roman"/>
-          <w:sz w:val="20"/>
-          <w:szCs w:val="20"/>
-        </w:rPr>
-      </w:pPr>
-      <w:r>
-        <w:rPr>
-          <w:rFonts w:ascii="Times New Roman" w:hAnsi="Times New Roman" w:cs="Times New Roman"/>
-          <w:sz w:val="20"/>
-          <w:szCs w:val="20"/>
-        </w:rPr>
-        <w:t>High-torque compact joint architecture</w:t>
-      </w:r>
-    </w:p>
-    <w:p>
-      <w:pPr>
-        <w:pStyle w:val="ListParagraph"/>
-        <w:numPr>
-          <w:ilvl w:val="0"/>
-          <w:numId w:val="4"/>
-        </w:numPr>
-        <w:spacing w:before="240" w:after="0"/>
-        <w:rPr>
-          <w:rFonts w:ascii="Times New Roman" w:hAnsi="Times New Roman" w:cs="Times New Roman"/>
-          <w:sz w:val="20"/>
-          <w:szCs w:val="20"/>
-        </w:rPr>
-      </w:pPr>
-      <w:r>
-        <w:rPr>
-          <w:rFonts w:ascii="Times New Roman" w:hAnsi="Times New Roman" w:cs="Times New Roman"/>
-          <w:sz w:val="20"/>
-          <w:szCs w:val="20"/>
-        </w:rPr>
-        <w:t xml:space="preserve">3D printed structural </w:t>
-      </w:r>
-      <w:r>
-        <w:rPr>
-          <w:rFonts w:ascii="Times New Roman" w:hAnsi="Times New Roman" w:cs="Times New Roman"/>
-          <w:i/>
-          <w:iCs/>
-          <w:sz w:val="20"/>
-          <w:szCs w:val="20"/>
-        </w:rPr>
-        <w:t>components</w:t>
-      </w:r>
-      <w:r>
-        <w:rPr>
-          <w:rFonts w:ascii="Times New Roman" w:hAnsi="Times New Roman" w:cs="Times New Roman"/>
-          <w:sz w:val="20"/>
-          <w:szCs w:val="20"/>
-        </w:rPr>
-        <w:t xml:space="preserve"> for rapid iteration</w:t>
-      </w:r>
-    </w:p>
-    <w:p>
-      <w:pPr>
-        <w:spacing w:before="200" w:after="0"/>
-        <w:rPr>
-          <w:rFonts w:ascii="Times New Roman" w:hAnsi="Times New Roman" w:cs="Times New Roman"/>
-          <w:sz w:val="22"/>
-          <w:szCs w:val="22"/>
-        </w:rPr>
-      </w:pPr>
-      <w:r>
-        <w:rPr>
-          <w:rFonts w:ascii="Times New Roman" w:hAnsi="Times New Roman" w:cs="Times New Roman"/>
-          <w:sz w:val="22"/>
-          <w:szCs w:val="22"/>
-        </w:rPr>
-        <w:t>Electrical System</w:t>
-      </w:r>
-    </w:p>
-    <w:p>
-      <w:pPr>
-        <w:pStyle w:val="ListParagraph"/>
-        <w:numPr>
-          <w:ilvl w:val="0"/>
-          <w:numId w:val="3"/>
-        </w:numPr>
-        <w:spacing w:after="0"/>
-        <w:rPr>
-          <w:rFonts w:ascii="Times New Roman" w:hAnsi="Times New Roman" w:cs="Times New Roman"/>
-          <w:sz w:val="20"/>
-          <w:szCs w:val="20"/>
-        </w:rPr>
-      </w:pPr>
-      <w:r>
-        <w:rPr>
-          <w:rFonts w:ascii="Times New Roman" w:hAnsi="Times New Roman" w:cs="Times New Roman"/>
-          <w:sz w:val="20"/>
-          <w:szCs w:val="20"/>
-        </w:rPr>
-        <w:t>12 custom FOC motor drive boards</w:t>
-      </w:r>
-    </w:p>
-    <w:p>
-      <w:pPr>
-        <w:pStyle w:val="ListParagraph"/>
-        <w:numPr>
-          <w:ilvl w:val="0"/>
-          <w:numId w:val="3"/>
-        </w:numPr>
-        <w:spacing w:before="240" w:after="0"/>
-        <w:rPr>
-          <w:rFonts w:ascii="Times New Roman" w:hAnsi="Times New Roman" w:cs="Times New Roman"/>
-          <w:sz w:val="20"/>
-          <w:szCs w:val="20"/>
-        </w:rPr>
-      </w:pPr>
-      <w:r>
-        <w:rPr>
-          <w:rFonts w:ascii="Times New Roman" w:hAnsi="Times New Roman" w:cs="Times New Roman"/>
-          <w:sz w:val="20"/>
-          <w:szCs w:val="20"/>
-        </w:rPr>
-        <w:t>Brushless motor control implementation</w:t>
-      </w:r>
-    </w:p>
-    <w:p>
-      <w:pPr>
-        <w:pStyle w:val="ListParagraph"/>
-        <w:numPr>
-          <w:ilvl w:val="0"/>
-          <w:numId w:val="3"/>
-        </w:numPr>
-        <w:spacing w:before="240" w:after="0"/>
-        <w:rPr>
-          <w:rFonts w:ascii="Times New Roman" w:hAnsi="Times New Roman" w:cs="Times New Roman"/>
-          <w:sz w:val="20"/>
-          <w:szCs w:val="20"/>
-        </w:rPr>
-      </w:pPr>
-      <w:r>
-        <w:rPr>
-          <w:rFonts w:ascii="Times New Roman" w:hAnsi="Times New Roman" w:cs="Times New Roman"/>
-          <w:sz w:val="20"/>
-          <w:szCs w:val="20"/>
-        </w:rPr>
-        <w:t>Distributed control architecture (CAN-based)</w:t>
-      </w:r>
-    </w:p>
-    <w:p>
-      <w:pPr>
-        <w:pStyle w:val="ListParagraph"/>
-        <w:numPr>
-          <w:ilvl w:val="0"/>
-          <w:numId w:val="3"/>
-        </w:numPr>
-        <w:spacing w:before="240" w:after="0"/>
-        <w:rPr>
-          <w:rFonts w:ascii="Times New Roman" w:hAnsi="Times New Roman" w:cs="Times New Roman"/>
-          <w:sz w:val="20"/>
-          <w:szCs w:val="20"/>
-        </w:rPr>
-      </w:pPr>
-      <w:r>
-        <w:rPr>
-          <w:rFonts w:ascii="Times New Roman" w:hAnsi="Times New Roman" w:cs="Times New Roman"/>
-          <w:sz w:val="20"/>
-          <w:szCs w:val="20"/>
-        </w:rPr>
-        <w:t>Embedded microcontroller coordination</w:t>
-      </w:r>
-    </w:p>
-    <w:p>
-      <w:pPr>
-        <w:spacing w:before="200" w:after="0"/>
-        <w:rPr>
-          <w:rFonts w:ascii="Times New Roman" w:hAnsi="Times New Roman" w:cs="Times New Roman"/>
-          <w:sz w:val="22"/>
-          <w:szCs w:val="22"/>
-        </w:rPr>
-      </w:pPr>
-      <w:r>
-        <w:rPr>
-          <w:rFonts w:ascii="Times New Roman" w:hAnsi="Times New Roman" w:cs="Times New Roman"/>
-          <w:sz w:val="22"/>
-          <w:szCs w:val="22"/>
-        </w:rPr>
-        <w:t>Control System</w:t>
-      </w:r>
-    </w:p>
-    <w:p>
-      <w:pPr>
-        <w:pStyle w:val="ListParagraph"/>
-        <w:numPr>
-          <w:ilvl w:val="0"/>
-          <w:numId w:val="2"/>
-        </w:numPr>
-        <w:spacing w:after="0"/>
-        <w:rPr>
-          <w:rFonts w:ascii="Times New Roman" w:hAnsi="Times New Roman" w:cs="Times New Roman"/>
-          <w:sz w:val="20"/>
-          <w:szCs w:val="20"/>
-        </w:rPr>
-      </w:pPr>
-      <w:r>
-        <w:rPr>
-          <w:rFonts w:ascii="Times New Roman" w:hAnsi="Times New Roman" w:cs="Times New Roman"/>
-          <w:sz w:val="20"/>
-          <w:szCs w:val="20"/>
-        </w:rPr>
-        <w:t>Real-time actuator command and feedback</w:t>
-      </w:r>
-    </w:p>
-    <w:p>
-      <w:pPr>
-        <w:pStyle w:val="ListParagraph"/>
-        <w:numPr>
-          <w:ilvl w:val="0"/>
-          <w:numId w:val="2"/>
-        </w:numPr>
-        <w:spacing w:before="240" w:after="0"/>
-        <w:rPr>
-          <w:rFonts w:ascii="Times New Roman" w:hAnsi="Times New Roman" w:cs="Times New Roman"/>
-          <w:sz w:val="20"/>
-          <w:szCs w:val="20"/>
-        </w:rPr>
-      </w:pPr>
-      <w:r>
-        <w:rPr>
-          <w:rFonts w:ascii="Times New Roman" w:hAnsi="Times New Roman" w:cs="Times New Roman"/>
-          <w:sz w:val="20"/>
-          <w:szCs w:val="20"/>
-        </w:rPr>
-        <w:t>Scalable firmware architecture</w:t>
-      </w:r>
-    </w:p>
-    <w:p>
-      <w:pPr>
-        <w:pStyle w:val="ListParagraph"/>
-        <w:numPr>
-          <w:ilvl w:val="0"/>
-          <w:numId w:val="2"/>
-        </w:numPr>
-        <w:spacing w:before="240" w:after="0"/>
-        <w:rPr>
-          <w:rFonts w:ascii="Times New Roman" w:hAnsi="Times New Roman" w:cs="Times New Roman"/>
-          <w:sz w:val="20"/>
-          <w:szCs w:val="20"/>
-        </w:rPr>
-      </w:pPr>
-      <w:r>
-        <w:rPr>
-          <w:rFonts w:ascii="Times New Roman" w:hAnsi="Times New Roman" w:cs="Times New Roman"/>
-          <w:sz w:val="20"/>
-          <w:szCs w:val="20"/>
-        </w:rPr>
-        <w:t>Expandable to autonomy stack integration</w:t>
-      </w:r>
-    </w:p>
-    <w:p>
-      <w:pPr>
-        <w:pBdr>
-          <w:bottom w:val="single" w:sz="6" w:space="1" w:color="auto"/>
-        </w:pBdr>
-        <w:spacing w:before="240" w:after="0"/>
-        <w:rPr>
-          <w:rFonts w:ascii="Times New Roman" w:hAnsi="Times New Roman" w:cs="Times New Roman"/>
-          <w:b/>
-          <w:bCs/>
-          <w:color w:val="156082" w:themeColor="accent1"/>
-          <w:sz w:val="28"/>
-          <w:szCs w:val="28"/>
-        </w:rPr>
-      </w:pPr>
-      <w:r>
-        <w:rPr>
-          <w:rFonts w:ascii="Times New Roman" w:hAnsi="Times New Roman" w:cs="Times New Roman"/>
-          <w:b/>
-          <w:bCs/>
-          <w:color w:val="156082" w:themeColor="accent1"/>
-          <w:sz w:val="28"/>
-          <w:szCs w:val="28"/>
-        </w:rPr>
-        <w:t>Engineering Objectives</w:t>
-      </w:r>
-    </w:p>
-    <w:p>
-      <w:pPr>
-        <w:spacing w:before="80" w:after="0"/>
-        <w:rPr>
-          <w:rFonts w:ascii="Times New Roman" w:hAnsi="Times New Roman" w:cs="Times New Roman"/>
-          <w:sz w:val="20"/>
-          <w:szCs w:val="20"/>
-        </w:rPr>
-      </w:pPr>
-      <w:r>
-        <w:rPr>
-          <w:rFonts w:ascii="Times New Roman" w:hAnsi="Times New Roman" w:cs="Times New Roman"/>
-          <w:sz w:val="20"/>
-          <w:szCs w:val="20"/>
-        </w:rPr>
-        <w:t>The quadruped platform is intended to:</w:t>
-      </w:r>
-    </w:p>
-    <w:p>
-      <w:pPr>
-        <w:pStyle w:val="ListParagraph"/>
-        <w:numPr>
-          <w:ilvl w:val="0"/>
-          <w:numId w:val="5"/>
-        </w:numPr>
-        <w:spacing w:after="0"/>
-        <w:rPr>
-          <w:rFonts w:ascii="Times New Roman" w:hAnsi="Times New Roman" w:cs="Times New Roman"/>
-          <w:sz w:val="20"/>
-          <w:szCs w:val="20"/>
-        </w:rPr>
-      </w:pPr>
-      <w:r>
-        <w:rPr>
-          <w:rFonts w:ascii="Times New Roman" w:hAnsi="Times New Roman" w:cs="Times New Roman"/>
-          <w:sz w:val="20"/>
-          <w:szCs w:val="20"/>
-        </w:rPr>
-        <w:t>Develop compact high-torque actuation systems</w:t>
-      </w:r>
-    </w:p>
-    <w:p>
-      <w:pPr>
-        <w:pStyle w:val="ListParagraph"/>
-        <w:numPr>
-          <w:ilvl w:val="0"/>
-          <w:numId w:val="5"/>
-        </w:numPr>
-        <w:spacing w:before="240" w:after="0"/>
-        <w:rPr>
-          <w:rFonts w:ascii="Times New Roman" w:hAnsi="Times New Roman" w:cs="Times New Roman"/>
-          <w:sz w:val="20"/>
-          <w:szCs w:val="20"/>
-        </w:rPr>
-      </w:pPr>
-      <w:r>
-        <w:rPr>
-          <w:rFonts w:ascii="Times New Roman" w:hAnsi="Times New Roman" w:cs="Times New Roman"/>
-          <w:sz w:val="20"/>
-          <w:szCs w:val="20"/>
-        </w:rPr>
-        <w:t>Implement custom motor control hardware</w:t>
-      </w:r>
-    </w:p>
-    <w:p>
-      <w:pPr>
-        <w:pStyle w:val="ListParagraph"/>
-        <w:numPr>
-          <w:ilvl w:val="0"/>
-          <w:numId w:val="5"/>
-        </w:numPr>
-        <w:spacing w:before="240" w:after="0"/>
-        <w:rPr>
-          <w:rFonts w:ascii="Times New Roman" w:hAnsi="Times New Roman" w:cs="Times New Roman"/>
-          <w:sz w:val="20"/>
-          <w:szCs w:val="20"/>
-        </w:rPr>
-      </w:pPr>
-      <w:r>
-        <w:rPr>
-          <w:rFonts w:ascii="Times New Roman" w:hAnsi="Times New Roman" w:cs="Times New Roman"/>
-          <w:sz w:val="20"/>
-          <w:szCs w:val="20"/>
-        </w:rPr>
-        <w:t>Integrate multi-axis robotic kinematics</w:t>
-      </w:r>
-    </w:p>
-    <w:p>
-      <w:pPr>
-        <w:pStyle w:val="ListParagraph"/>
-        <w:numPr>
-          <w:ilvl w:val="0"/>
-          <w:numId w:val="5"/>
-        </w:numPr>
-        <w:spacing w:before="240" w:after="0"/>
-        <w:rPr>
-          <w:rFonts w:ascii="Times New Roman" w:hAnsi="Times New Roman" w:cs="Times New Roman"/>
-          <w:sz w:val="20"/>
-          <w:szCs w:val="20"/>
-        </w:rPr>
-      </w:pPr>
-      <w:r>
-        <w:rPr>
-          <w:rFonts w:ascii="Times New Roman" w:hAnsi="Times New Roman" w:cs="Times New Roman"/>
-          <w:sz w:val="20"/>
-          <w:szCs w:val="20"/>
-        </w:rPr>
-        <w:t>Serve as a research and experimentation platform</w:t>
-      </w:r>
-    </w:p>
-    <w:p>
-      <w:pPr>
-        <w:pStyle w:val="ListParagraph"/>
-        <w:numPr>
-          <w:ilvl w:val="0"/>
-          <w:numId w:val="5"/>
-        </w:numPr>
-        <w:spacing w:before="240" w:after="0"/>
-        <w:rPr>
-          <w:rFonts w:ascii="Times New Roman" w:hAnsi="Times New Roman" w:cs="Times New Roman"/>
-          <w:sz w:val="20"/>
-          <w:szCs w:val="20"/>
-        </w:rPr>
-      </w:pPr>
-      <w:r>
-        <w:rPr>
-          <w:rFonts w:ascii="Times New Roman" w:hAnsi="Times New Roman" w:cs="Times New Roman"/>
-          <w:sz w:val="20"/>
-          <w:szCs w:val="20"/>
-        </w:rPr>
-        <w:t>Provide applied experience in robotics systems engineering</w:t>
-      </w:r>
-    </w:p>
-    <w:p>
-      <w:pPr>
-        <w:pStyle w:val="ListParagraph"/>
-        <w:numPr>
-          <w:ilvl w:val="0"/>
-          <w:numId w:val="5"/>
-        </w:numPr>
-        <w:spacing w:before="240" w:after="0"/>
-        <w:rPr>
-          <w:rFonts w:ascii="Times New Roman" w:hAnsi="Times New Roman" w:cs="Times New Roman"/>
-          <w:sz w:val="20"/>
-          <w:szCs w:val="20"/>
-        </w:rPr>
-      </w:pPr>
-      <w:r>
-        <w:rPr>
-          <w:rFonts w:ascii="Times New Roman" w:hAnsi="Times New Roman" w:cs="Times New Roman"/>
-          <w:sz w:val="20"/>
-          <w:szCs w:val="20"/>
-        </w:rPr>
-        <w:t>This project mirrors the architecture of industry level legged robotic systems at a prototype scale.</w:t>
-      </w:r>
-    </w:p>
-    <w:p>
-      <w:pPr>
-        <w:pBdr>
-          <w:bottom w:val="single" w:sz="6" w:space="1" w:color="auto"/>
-        </w:pBdr>
-        <w:spacing w:before="240" w:after="0"/>
-        <w:rPr>
-          <w:rFonts w:ascii="Times New Roman" w:hAnsi="Times New Roman" w:cs="Times New Roman"/>
-          <w:b/>
-          <w:bCs/>
-          <w:color w:val="215E99" w:themeColor="text2" w:themeTint="BF"/>
-        </w:rPr>
-      </w:pPr>
-    </w:p>
-    <w:p>
-      <w:pPr>
-        <w:pBdr>
-          <w:bottom w:val="single" w:sz="6" w:space="1" w:color="auto"/>
-        </w:pBdr>
-        <w:spacing w:before="240" w:after="0"/>
-        <w:rPr>
-          <w:rFonts w:ascii="Times New Roman" w:hAnsi="Times New Roman" w:cs="Times New Roman"/>
-          <w:b/>
-          <w:bCs/>
-          <w:color w:val="215E99" w:themeColor="text2" w:themeTint="BF"/>
-        </w:rPr>
-      </w:pPr>
-    </w:p>
-    <w:p>
-      <w:pPr>
-        <w:pBdr>
-          <w:bottom w:val="single" w:sz="6" w:space="1" w:color="auto"/>
-        </w:pBdr>
-        <w:spacing w:before="240" w:after="0"/>
-        <w:rPr>
-          <w:rFonts w:ascii="Times New Roman" w:hAnsi="Times New Roman" w:cs="Times New Roman"/>
-          <w:b/>
-          <w:bCs/>
-          <w:color w:val="156082" w:themeColor="accent1"/>
-          <w:sz w:val="28"/>
-          <w:szCs w:val="28"/>
-        </w:rPr>
-      </w:pPr>
-      <w:r>
-        <w:rPr>
-          <w:rFonts w:ascii="Times New Roman" w:hAnsi="Times New Roman" w:cs="Times New Roman"/>
-          <w:b/>
-          <w:bCs/>
-          <w:color w:val="156082" w:themeColor="accent1"/>
-          <w:sz w:val="28"/>
-          <w:szCs w:val="28"/>
-        </w:rPr>
         <w:t>Funding Request</w:t>
       </w:r>
     </w:p>
@@ -819,23 +285,39 @@
           <w:sz w:val="20"/>
           <w:szCs w:val="20"/>
         </w:rPr>
-        <w:t>To complete the first fully functional prototype, funding is requested in the amount of $</w:t>
-      </w:r>
-      <w:r>
-        <w:rPr>
-          <w:rFonts w:ascii="Times New Roman" w:hAnsi="Times New Roman" w:cs="Times New Roman"/>
-          <w:sz w:val="20"/>
-          <w:szCs w:val="20"/>
-        </w:rPr>
-        <w:t>2,002.63</w:t>
-      </w:r>
-      <w:r>
-        <w:rPr>
-          <w:rFonts w:ascii="Times New Roman" w:hAnsi="Times New Roman" w:cs="Times New Roman"/>
-          <w:sz w:val="20"/>
-          <w:szCs w:val="20"/>
-        </w:rPr>
-        <w:t>.</w:t>
+        <w:t xml:space="preserve">To complete the first fully functional prototype, funding is requested in the </w:t>
+      </w:r>
+      <w:r>
+        <w:rPr>
+          <w:rFonts w:ascii="Times New Roman" w:hAnsi="Times New Roman" w:cs="Times New Roman"/>
+          <w:sz w:val="20"/>
+          <w:szCs w:val="20"/>
+        </w:rPr>
+        <w:t xml:space="preserve">any </w:t>
+      </w:r>
+      <w:r>
+        <w:rPr>
+          <w:rFonts w:ascii="Times New Roman" w:hAnsi="Times New Roman" w:cs="Times New Roman"/>
+          <w:sz w:val="20"/>
+          <w:szCs w:val="20"/>
+        </w:rPr>
+        <w:t>amount of $2,</w:t>
+      </w:r>
+      <w:r>
+        <w:rPr>
+          <w:rFonts w:ascii="Times New Roman" w:hAnsi="Times New Roman" w:cs="Times New Roman"/>
+          <w:sz w:val="20"/>
+          <w:szCs w:val="20"/>
+        </w:rPr>
+        <w:t>702</w:t>
+      </w:r>
+      <w:r>
+        <w:rPr>
+          <w:rFonts w:ascii="Times New Roman" w:hAnsi="Times New Roman" w:cs="Times New Roman"/>
+          <w:sz w:val="20"/>
+          <w:szCs w:val="20"/>
+        </w:rPr>
+        <w:t>.63.</w:t>
       </w:r>
     </w:p>
     <w:tbl>
@@ -1204,7 +686,7 @@
                 <w:sz w:val="20"/>
                 <w:szCs w:val="20"/>
               </w:rPr>
-              <w:t>Raspberry Pi</w:t>
+              <w:t>Electronics</w:t>
             </w:r>
           </w:p>
         </w:tc>
@@ -1229,7 +711,7 @@
                 <w:sz w:val="20"/>
                 <w:szCs w:val="20"/>
               </w:rPr>
-              <w:t>1</w:t>
+              <w:t>-</w:t>
             </w:r>
           </w:p>
         </w:tc>
@@ -1254,15 +736,7 @@
                 <w:sz w:val="20"/>
                 <w:szCs w:val="20"/>
               </w:rPr>
-              <w:t>$80</w:t>
-            </w:r>
-            <w:r>
-              <w:rPr>
-                <w:rFonts w:ascii="Times New Roman" w:hAnsi="Times New Roman" w:cs="Times New Roman"/>
-                <w:sz w:val="20"/>
-                <w:szCs w:val="20"/>
-              </w:rPr>
-              <w:t>.00</w:t>
+              <w:t>$200.00</w:t>
             </w:r>
           </w:p>
         </w:tc>
@@ -1363,6 +837,90 @@
               <w:jc w:val="center"/>
               <w:rPr>
                 <w:rFonts w:ascii="Times New Roman" w:hAnsi="Times New Roman" w:cs="Times New Roman"/>
+                <w:b w:val="0"/>
+                <w:bCs w:val="0"/>
+                <w:sz w:val="20"/>
+                <w:szCs w:val="20"/>
+              </w:rPr>
+            </w:pPr>
+            <w:r>
+              <w:rPr>
+                <w:rFonts w:ascii="Times New Roman" w:hAnsi="Times New Roman" w:cs="Times New Roman"/>
+                <w:b w:val="0"/>
+                <w:bCs w:val="0"/>
+                <w:sz w:val="20"/>
+                <w:szCs w:val="20"/>
+              </w:rPr>
+              <w:t>Body Assembly</w:t>
+            </w:r>
+          </w:p>
+        </w:tc>
+        <w:tc>
+          <w:tcPr>
+            <w:tcW w:w="3117" w:type="dxa"/>
+          </w:tcPr>
+          <w:p>
+            <w:pPr>
+              <w:spacing w:before="120"/>
+              <w:jc w:val="center"/>
+              <w:cnfStyle w:val="000000000000" w:firstRow="0" w:lastRow="0" w:firstColumn="0" w:lastColumn="0" w:oddVBand="0" w:evenVBand="0" w:oddHBand="0" w:evenHBand="0" w:firstRowFirstColumn="0" w:firstRowLastColumn="0" w:lastRowFirstColumn="0" w:lastRowLastColumn="0"/>
+              <w:rPr>
+                <w:rFonts w:ascii="Times New Roman" w:hAnsi="Times New Roman" w:cs="Times New Roman"/>
+                <w:sz w:val="20"/>
+                <w:szCs w:val="20"/>
+              </w:rPr>
+            </w:pPr>
+            <w:r>
+              <w:rPr>
+                <w:rFonts w:ascii="Times New Roman" w:hAnsi="Times New Roman" w:cs="Times New Roman"/>
+                <w:sz w:val="20"/>
+                <w:szCs w:val="20"/>
+              </w:rPr>
+              <w:t>1</w:t>
+            </w:r>
+          </w:p>
+        </w:tc>
+        <w:tc>
+          <w:tcPr>
+            <w:tcW w:w="3117" w:type="dxa"/>
+          </w:tcPr>
+          <w:p>
+            <w:pPr>
+              <w:spacing w:before="120"/>
+              <w:jc w:val="center"/>
+              <w:cnfStyle w:val="000000000000" w:firstRow="0" w:lastRow="0" w:firstColumn="0" w:lastColumn="0" w:oddVBand="0" w:evenVBand="0" w:oddHBand="0" w:evenHBand="0" w:firstRowFirstColumn="0" w:firstRowLastColumn="0" w:lastRowFirstColumn="0" w:lastRowLastColumn="0"/>
+              <w:rPr>
+                <w:rFonts w:ascii="Times New Roman" w:hAnsi="Times New Roman" w:cs="Times New Roman"/>
+                <w:sz w:val="20"/>
+                <w:szCs w:val="20"/>
+              </w:rPr>
+            </w:pPr>
+            <w:r>
+              <w:rPr>
+                <w:rFonts w:ascii="Times New Roman" w:hAnsi="Times New Roman" w:cs="Times New Roman"/>
+                <w:sz w:val="20"/>
+                <w:szCs w:val="20"/>
+              </w:rPr>
+              <w:t>$500.00</w:t>
+            </w:r>
+          </w:p>
+        </w:tc>
+      </w:tr>
+      <w:tr>
+        <w:trPr>
+          <w:cnfStyle w:val="000000100000" w:firstRow="0" w:lastRow="0" w:firstColumn="0" w:lastColumn="0" w:oddVBand="0" w:evenVBand="0" w:oddHBand="1" w:evenHBand="0" w:firstRowFirstColumn="0" w:firstRowLastColumn="0" w:lastRowFirstColumn="0" w:lastRowLastColumn="0"/>
+        </w:trPr>
+        <w:tc>
+          <w:tcPr>
+            <w:cnfStyle w:val="001000000000" w:firstRow="0" w:lastRow="0" w:firstColumn="1" w:lastColumn="0" w:oddVBand="0" w:evenVBand="0" w:oddHBand="0" w:evenHBand="0" w:firstRowFirstColumn="0" w:firstRowLastColumn="0" w:lastRowFirstColumn="0" w:lastRowLastColumn="0"/>
+            <w:tcW w:w="3116" w:type="dxa"/>
+          </w:tcPr>
+          <w:p>
+            <w:pPr>
+              <w:spacing w:before="120"/>
+              <w:jc w:val="center"/>
+              <w:rPr>
+                <w:rFonts w:ascii="Times New Roman" w:hAnsi="Times New Roman" w:cs="Times New Roman"/>
                 <w:sz w:val="20"/>
                 <w:szCs w:val="20"/>
               </w:rPr>
@@ -1377,7 +935,7 @@
             <w:pPr>
               <w:spacing w:before="120"/>
               <w:jc w:val="right"/>
-              <w:cnfStyle w:val="000000000000" w:firstRow="0" w:lastRow="0" w:firstColumn="0" w:lastColumn="0" w:oddVBand="0" w:evenVBand="0" w:oddHBand="0" w:evenHBand="0" w:firstRowFirstColumn="0" w:firstRowLastColumn="0" w:lastRowFirstColumn="0" w:lastRowLastColumn="0"/>
+              <w:cnfStyle w:val="000000100000" w:firstRow="0" w:lastRow="0" w:firstColumn="0" w:lastColumn="0" w:oddVBand="0" w:evenVBand="0" w:oddHBand="1" w:evenHBand="0" w:firstRowFirstColumn="0" w:firstRowLastColumn="0" w:lastRowFirstColumn="0" w:lastRowLastColumn="0"/>
               <w:rPr>
                 <w:rFonts w:ascii="Times New Roman" w:hAnsi="Times New Roman" w:cs="Times New Roman"/>
                 <w:sz w:val="20"/>
@@ -1402,7 +960,7 @@
             <w:pPr>
               <w:spacing w:before="120"/>
               <w:jc w:val="center"/>
-              <w:cnfStyle w:val="000000000000" w:firstRow="0" w:lastRow="0" w:firstColumn="0" w:lastColumn="0" w:oddVBand="0" w:evenVBand="0" w:oddHBand="0" w:evenHBand="0" w:firstRowFirstColumn="0" w:firstRowLastColumn="0" w:lastRowFirstColumn="0" w:lastRowLastColumn="0"/>
+              <w:cnfStyle w:val="000000100000" w:firstRow="0" w:lastRow="0" w:firstColumn="0" w:lastColumn="0" w:oddVBand="0" w:evenVBand="0" w:oddHBand="1" w:evenHBand="0" w:firstRowFirstColumn="0" w:firstRowLastColumn="0" w:lastRowFirstColumn="0" w:lastRowLastColumn="0"/>
               <w:rPr>
                 <w:rFonts w:ascii="Times New Roman" w:hAnsi="Times New Roman" w:cs="Times New Roman"/>
                 <w:sz w:val="20"/>
@@ -1415,7 +973,23 @@
                 <w:sz w:val="20"/>
                 <w:szCs w:val="20"/>
               </w:rPr>
-              <w:t>$2002.63</w:t>
+              <w:t>$</w:t>
+            </w:r>
+            <w:r>
+              <w:rPr>
+                <w:rFonts w:ascii="Times New Roman" w:hAnsi="Times New Roman" w:cs="Times New Roman"/>
+                <w:sz w:val="20"/>
+                <w:szCs w:val="20"/>
+              </w:rPr>
+              <w:t>2702</w:t>
+            </w:r>
+            <w:r>
+              <w:rPr>
+                <w:rFonts w:ascii="Times New Roman" w:hAnsi="Times New Roman" w:cs="Times New Roman"/>
+                <w:sz w:val="20"/>
+                <w:szCs w:val="20"/>
+              </w:rPr>
+              <w:t>.63</w:t>
             </w:r>
           </w:p>
         </w:tc>
@@ -1637,6 +1211,936 @@
           <w:szCs w:val="20"/>
         </w:rPr>
         <w:t xml:space="preserve">Support contributes directly to hands-on engineering development and applied robotics innovation. </w:t>
+      </w:r>
+    </w:p>
+    <w:p>
+      <w:pPr>
+        <w:spacing w:before="120" w:after="0"/>
+        <w:rPr>
+          <w:rFonts w:ascii="Times New Roman" w:hAnsi="Times New Roman" w:cs="Times New Roman"/>
+          <w:sz w:val="20"/>
+          <w:szCs w:val="20"/>
+        </w:rPr>
+      </w:pPr>
+    </w:p>
+    <w:p>
+      <w:pPr>
+        <w:pBdr>
+          <w:bottom w:val="single" w:sz="6" w:space="1" w:color="auto"/>
+        </w:pBdr>
+        <w:spacing w:before="240" w:after="0"/>
+        <w:rPr>
+          <w:rFonts w:ascii="Times New Roman" w:hAnsi="Times New Roman" w:cs="Times New Roman"/>
+          <w:b/>
+          <w:bCs/>
+          <w:color w:val="156082" w:themeColor="accent1"/>
+          <w:sz w:val="28"/>
+          <w:szCs w:val="28"/>
+        </w:rPr>
+      </w:pPr>
+      <w:r>
+        <w:rPr>
+          <w:rFonts w:ascii="Times New Roman" w:hAnsi="Times New Roman" w:cs="Times New Roman"/>
+          <w:b/>
+          <w:bCs/>
+          <w:color w:val="156082" w:themeColor="accent1"/>
+          <w:sz w:val="28"/>
+          <w:szCs w:val="28"/>
+        </w:rPr>
+        <w:lastRenderedPageBreak/>
+        <w:t>Engineering Objectives</w:t>
+      </w:r>
+    </w:p>
+    <w:p>
+      <w:pPr>
+        <w:spacing w:before="80" w:after="0"/>
+        <w:rPr>
+          <w:rFonts w:ascii="Times New Roman" w:hAnsi="Times New Roman" w:cs="Times New Roman"/>
+          <w:sz w:val="20"/>
+          <w:szCs w:val="20"/>
+        </w:rPr>
+      </w:pPr>
+      <w:r>
+        <w:rPr>
+          <w:rFonts w:ascii="Times New Roman" w:hAnsi="Times New Roman" w:cs="Times New Roman"/>
+          <w:sz w:val="20"/>
+          <w:szCs w:val="20"/>
+        </w:rPr>
+        <w:t>The quadruped platform is intended to:</w:t>
+      </w:r>
+    </w:p>
+    <w:p>
+      <w:pPr>
+        <w:pStyle w:val="ListParagraph"/>
+        <w:numPr>
+          <w:ilvl w:val="0"/>
+          <w:numId w:val="5"/>
+        </w:numPr>
+        <w:spacing w:after="0"/>
+        <w:rPr>
+          <w:rFonts w:ascii="Times New Roman" w:hAnsi="Times New Roman" w:cs="Times New Roman"/>
+          <w:sz w:val="20"/>
+          <w:szCs w:val="20"/>
+        </w:rPr>
+      </w:pPr>
+      <w:r>
+        <w:rPr>
+          <w:rFonts w:ascii="Times New Roman" w:hAnsi="Times New Roman" w:cs="Times New Roman"/>
+          <w:sz w:val="20"/>
+          <w:szCs w:val="20"/>
+        </w:rPr>
+        <w:t>Develop compact high-torque actuation systems</w:t>
+      </w:r>
+    </w:p>
+    <w:p>
+      <w:pPr>
+        <w:pStyle w:val="ListParagraph"/>
+        <w:numPr>
+          <w:ilvl w:val="0"/>
+          <w:numId w:val="5"/>
+        </w:numPr>
+        <w:spacing w:before="240" w:after="0"/>
+        <w:rPr>
+          <w:rFonts w:ascii="Times New Roman" w:hAnsi="Times New Roman" w:cs="Times New Roman"/>
+          <w:sz w:val="20"/>
+          <w:szCs w:val="20"/>
+        </w:rPr>
+      </w:pPr>
+      <w:r>
+        <w:rPr>
+          <w:rFonts w:ascii="Times New Roman" w:hAnsi="Times New Roman" w:cs="Times New Roman"/>
+          <w:sz w:val="20"/>
+          <w:szCs w:val="20"/>
+        </w:rPr>
+        <w:t>Implement custom motor control hardware</w:t>
+      </w:r>
+    </w:p>
+    <w:p>
+      <w:pPr>
+        <w:pStyle w:val="ListParagraph"/>
+        <w:numPr>
+          <w:ilvl w:val="0"/>
+          <w:numId w:val="5"/>
+        </w:numPr>
+        <w:spacing w:before="240" w:after="0"/>
+        <w:rPr>
+          <w:rFonts w:ascii="Times New Roman" w:hAnsi="Times New Roman" w:cs="Times New Roman"/>
+          <w:sz w:val="20"/>
+          <w:szCs w:val="20"/>
+        </w:rPr>
+      </w:pPr>
+      <w:r>
+        <w:rPr>
+          <w:rFonts w:ascii="Times New Roman" w:hAnsi="Times New Roman" w:cs="Times New Roman"/>
+          <w:sz w:val="20"/>
+          <w:szCs w:val="20"/>
+        </w:rPr>
+        <w:t>Integrate multi-axis robotic kinematics</w:t>
+      </w:r>
+    </w:p>
+    <w:p>
+      <w:pPr>
+        <w:pStyle w:val="ListParagraph"/>
+        <w:numPr>
+          <w:ilvl w:val="0"/>
+          <w:numId w:val="5"/>
+        </w:numPr>
+        <w:spacing w:before="240" w:after="0"/>
+        <w:rPr>
+          <w:rFonts w:ascii="Times New Roman" w:hAnsi="Times New Roman" w:cs="Times New Roman"/>
+          <w:sz w:val="20"/>
+          <w:szCs w:val="20"/>
+        </w:rPr>
+      </w:pPr>
+      <w:r>
+        <w:rPr>
+          <w:rFonts w:ascii="Times New Roman" w:hAnsi="Times New Roman" w:cs="Times New Roman"/>
+          <w:sz w:val="20"/>
+          <w:szCs w:val="20"/>
+        </w:rPr>
+        <w:t>Serve as a research and experimentation platform</w:t>
+      </w:r>
+    </w:p>
+    <w:p>
+      <w:pPr>
+        <w:pStyle w:val="ListParagraph"/>
+        <w:numPr>
+          <w:ilvl w:val="0"/>
+          <w:numId w:val="5"/>
+        </w:numPr>
+        <w:spacing w:before="240" w:after="0"/>
+        <w:rPr>
+          <w:rFonts w:ascii="Times New Roman" w:hAnsi="Times New Roman" w:cs="Times New Roman"/>
+          <w:sz w:val="20"/>
+          <w:szCs w:val="20"/>
+        </w:rPr>
+      </w:pPr>
+      <w:r>
+        <w:rPr>
+          <w:rFonts w:ascii="Times New Roman" w:hAnsi="Times New Roman" w:cs="Times New Roman"/>
+          <w:sz w:val="20"/>
+          <w:szCs w:val="20"/>
+        </w:rPr>
+        <w:t>Provide applied experience in robotics systems engineering</w:t>
+      </w:r>
+    </w:p>
+    <w:p>
+      <w:pPr>
+        <w:pStyle w:val="ListParagraph"/>
+        <w:numPr>
+          <w:ilvl w:val="0"/>
+          <w:numId w:val="5"/>
+        </w:numPr>
+        <w:spacing w:before="240" w:after="0"/>
+        <w:rPr>
+          <w:rFonts w:ascii="Times New Roman" w:hAnsi="Times New Roman" w:cs="Times New Roman"/>
+          <w:sz w:val="20"/>
+          <w:szCs w:val="20"/>
+        </w:rPr>
+      </w:pPr>
+      <w:r>
+        <w:rPr>
+          <w:rFonts w:ascii="Times New Roman" w:hAnsi="Times New Roman" w:cs="Times New Roman"/>
+          <w:sz w:val="20"/>
+          <w:szCs w:val="20"/>
+        </w:rPr>
+        <w:t>This project mirrors the architecture of industry level legged robotic systems at a prototype scale.</w:t>
+      </w:r>
+    </w:p>
+    <w:p>
+      <w:pPr>
+        <w:pBdr>
+          <w:bottom w:val="single" w:sz="6" w:space="1" w:color="auto"/>
+        </w:pBdr>
+        <w:spacing w:before="240" w:after="0"/>
+        <w:rPr>
+          <w:rFonts w:ascii="Times New Roman" w:hAnsi="Times New Roman" w:cs="Times New Roman"/>
+          <w:b/>
+          <w:bCs/>
+          <w:color w:val="156082" w:themeColor="accent1"/>
+          <w:sz w:val="28"/>
+          <w:szCs w:val="28"/>
+        </w:rPr>
+      </w:pPr>
+      <w:r>
+        <w:rPr>
+          <w:rFonts w:ascii="Times New Roman" w:hAnsi="Times New Roman" w:cs="Times New Roman"/>
+          <w:b/>
+          <w:bCs/>
+          <w:color w:val="156082" w:themeColor="accent1"/>
+          <w:sz w:val="28"/>
+          <w:szCs w:val="28"/>
+        </w:rPr>
+        <w:t>Technical Architecture Overview</w:t>
+      </w:r>
+    </w:p>
+    <w:p>
+      <w:pPr>
+        <w:spacing w:before="80" w:after="0"/>
+        <w:rPr>
+          <w:rFonts w:ascii="Times New Roman" w:hAnsi="Times New Roman" w:cs="Times New Roman"/>
+          <w:sz w:val="20"/>
+          <w:szCs w:val="20"/>
+        </w:rPr>
+      </w:pPr>
+      <w:r>
+        <w:rPr>
+          <w:rFonts w:ascii="Times New Roman" w:hAnsi="Times New Roman" w:cs="Times New Roman"/>
+          <w:sz w:val="20"/>
+          <w:szCs w:val="20"/>
+        </w:rPr>
+        <w:t>The robot is designed around custom cycloidal drive actuators, dedicated Field-Orientated Control (FOC) motor driver boards, and a centralized embedded control architecture. The goal is to create a scalable robotics testbed capable of supporting locomotion research, motor control experimentation, and future autonomy integration.</w:t>
+      </w:r>
+    </w:p>
+    <w:p>
+      <w:pPr>
+        <w:spacing w:before="200" w:after="0"/>
+        <w:rPr>
+          <w:rFonts w:ascii="Times New Roman" w:hAnsi="Times New Roman" w:cs="Times New Roman"/>
+          <w:sz w:val="22"/>
+          <w:szCs w:val="22"/>
+        </w:rPr>
+      </w:pPr>
+      <w:r>
+        <w:rPr>
+          <w:rFonts w:ascii="Times New Roman" w:hAnsi="Times New Roman" w:cs="Times New Roman"/>
+          <w:sz w:val="22"/>
+          <w:szCs w:val="22"/>
+        </w:rPr>
+        <w:t>Mechanical System</w:t>
+      </w:r>
+    </w:p>
+    <w:p>
+      <w:pPr>
+        <w:pStyle w:val="ListParagraph"/>
+        <w:numPr>
+          <w:ilvl w:val="0"/>
+          <w:numId w:val="4"/>
+        </w:numPr>
+        <w:spacing w:after="0"/>
+        <w:rPr>
+          <w:rFonts w:ascii="Times New Roman" w:hAnsi="Times New Roman" w:cs="Times New Roman"/>
+          <w:sz w:val="20"/>
+          <w:szCs w:val="20"/>
+        </w:rPr>
+      </w:pPr>
+      <w:r>
+        <w:rPr>
+          <w:rFonts w:ascii="Times New Roman" w:hAnsi="Times New Roman" w:cs="Times New Roman"/>
+          <w:sz w:val="20"/>
+          <w:szCs w:val="20"/>
+        </w:rPr>
+        <w:t>12 experimental cycloidal actuators (17:1 reduction)</w:t>
+      </w:r>
+    </w:p>
+    <w:p>
+      <w:pPr>
+        <w:pStyle w:val="ListParagraph"/>
+        <w:numPr>
+          <w:ilvl w:val="0"/>
+          <w:numId w:val="4"/>
+        </w:numPr>
+        <w:spacing w:before="240" w:after="0"/>
+        <w:rPr>
+          <w:rFonts w:ascii="Times New Roman" w:hAnsi="Times New Roman" w:cs="Times New Roman"/>
+          <w:sz w:val="20"/>
+          <w:szCs w:val="20"/>
+        </w:rPr>
+      </w:pPr>
+      <w:r>
+        <w:rPr>
+          <w:rFonts w:ascii="Times New Roman" w:hAnsi="Times New Roman" w:cs="Times New Roman"/>
+          <w:sz w:val="20"/>
+          <w:szCs w:val="20"/>
+        </w:rPr>
+        <w:t>Modular leg assemblies</w:t>
+      </w:r>
+    </w:p>
+    <w:p>
+      <w:pPr>
+        <w:pStyle w:val="ListParagraph"/>
+        <w:numPr>
+          <w:ilvl w:val="0"/>
+          <w:numId w:val="4"/>
+        </w:numPr>
+        <w:spacing w:before="240" w:after="0"/>
+        <w:rPr>
+          <w:rFonts w:ascii="Times New Roman" w:hAnsi="Times New Roman" w:cs="Times New Roman"/>
+          <w:sz w:val="20"/>
+          <w:szCs w:val="20"/>
+        </w:rPr>
+      </w:pPr>
+      <w:r>
+        <w:rPr>
+          <w:rFonts w:ascii="Times New Roman" w:hAnsi="Times New Roman" w:cs="Times New Roman"/>
+          <w:sz w:val="20"/>
+          <w:szCs w:val="20"/>
+        </w:rPr>
+        <w:t>High-torque compact joint architecture</w:t>
+      </w:r>
+    </w:p>
+    <w:p>
+      <w:pPr>
+        <w:pStyle w:val="ListParagraph"/>
+        <w:numPr>
+          <w:ilvl w:val="0"/>
+          <w:numId w:val="4"/>
+        </w:numPr>
+        <w:spacing w:before="240" w:after="0"/>
+        <w:rPr>
+          <w:rFonts w:ascii="Times New Roman" w:hAnsi="Times New Roman" w:cs="Times New Roman"/>
+          <w:sz w:val="20"/>
+          <w:szCs w:val="20"/>
+        </w:rPr>
+      </w:pPr>
+      <w:r>
+        <w:rPr>
+          <w:rFonts w:ascii="Times New Roman" w:hAnsi="Times New Roman" w:cs="Times New Roman"/>
+          <w:sz w:val="20"/>
+          <w:szCs w:val="20"/>
+        </w:rPr>
+        <w:t xml:space="preserve">3D printed structural </w:t>
+      </w:r>
+      <w:r>
+        <w:rPr>
+          <w:rFonts w:ascii="Times New Roman" w:hAnsi="Times New Roman" w:cs="Times New Roman"/>
+          <w:i/>
+          <w:iCs/>
+          <w:sz w:val="20"/>
+          <w:szCs w:val="20"/>
+        </w:rPr>
+        <w:t>components</w:t>
+      </w:r>
+      <w:r>
+        <w:rPr>
+          <w:rFonts w:ascii="Times New Roman" w:hAnsi="Times New Roman" w:cs="Times New Roman"/>
+          <w:sz w:val="20"/>
+          <w:szCs w:val="20"/>
+        </w:rPr>
+        <w:t xml:space="preserve"> for rapid iteration</w:t>
+      </w:r>
+    </w:p>
+    <w:p>
+      <w:pPr>
+        <w:spacing w:before="200" w:after="0"/>
+        <w:rPr>
+          <w:rFonts w:ascii="Times New Roman" w:hAnsi="Times New Roman" w:cs="Times New Roman"/>
+          <w:sz w:val="22"/>
+          <w:szCs w:val="22"/>
+        </w:rPr>
+      </w:pPr>
+      <w:r>
+        <w:rPr>
+          <w:rFonts w:ascii="Times New Roman" w:hAnsi="Times New Roman" w:cs="Times New Roman"/>
+          <w:sz w:val="22"/>
+          <w:szCs w:val="22"/>
+        </w:rPr>
+        <w:t>Electrical System</w:t>
+      </w:r>
+    </w:p>
+    <w:p>
+      <w:pPr>
+        <w:pStyle w:val="ListParagraph"/>
+        <w:numPr>
+          <w:ilvl w:val="0"/>
+          <w:numId w:val="3"/>
+        </w:numPr>
+        <w:spacing w:after="0"/>
+        <w:rPr>
+          <w:rFonts w:ascii="Times New Roman" w:hAnsi="Times New Roman" w:cs="Times New Roman"/>
+          <w:sz w:val="20"/>
+          <w:szCs w:val="20"/>
+        </w:rPr>
+      </w:pPr>
+      <w:r>
+        <w:rPr>
+          <w:rFonts w:ascii="Times New Roman" w:hAnsi="Times New Roman" w:cs="Times New Roman"/>
+          <w:sz w:val="20"/>
+          <w:szCs w:val="20"/>
+        </w:rPr>
+        <w:t>12 custom FOC motor drive boards</w:t>
+      </w:r>
+    </w:p>
+    <w:p>
+      <w:pPr>
+        <w:pStyle w:val="ListParagraph"/>
+        <w:numPr>
+          <w:ilvl w:val="0"/>
+          <w:numId w:val="3"/>
+        </w:numPr>
+        <w:spacing w:before="240" w:after="0"/>
+        <w:rPr>
+          <w:rFonts w:ascii="Times New Roman" w:hAnsi="Times New Roman" w:cs="Times New Roman"/>
+          <w:sz w:val="20"/>
+          <w:szCs w:val="20"/>
+        </w:rPr>
+      </w:pPr>
+      <w:r>
+        <w:rPr>
+          <w:rFonts w:ascii="Times New Roman" w:hAnsi="Times New Roman" w:cs="Times New Roman"/>
+          <w:sz w:val="20"/>
+          <w:szCs w:val="20"/>
+        </w:rPr>
+        <w:t>Brushless motor control implementation</w:t>
+      </w:r>
+    </w:p>
+    <w:p>
+      <w:pPr>
+        <w:pStyle w:val="ListParagraph"/>
+        <w:numPr>
+          <w:ilvl w:val="0"/>
+          <w:numId w:val="3"/>
+        </w:numPr>
+        <w:spacing w:before="240" w:after="0"/>
+        <w:rPr>
+          <w:rFonts w:ascii="Times New Roman" w:hAnsi="Times New Roman" w:cs="Times New Roman"/>
+          <w:sz w:val="20"/>
+          <w:szCs w:val="20"/>
+        </w:rPr>
+      </w:pPr>
+      <w:r>
+        <w:rPr>
+          <w:rFonts w:ascii="Times New Roman" w:hAnsi="Times New Roman" w:cs="Times New Roman"/>
+          <w:sz w:val="20"/>
+          <w:szCs w:val="20"/>
+        </w:rPr>
+        <w:t>Distributed control architecture (CAN-based)</w:t>
+      </w:r>
+    </w:p>
+    <w:p>
+      <w:pPr>
+        <w:pStyle w:val="ListParagraph"/>
+        <w:numPr>
+          <w:ilvl w:val="0"/>
+          <w:numId w:val="3"/>
+        </w:numPr>
+        <w:spacing w:before="240" w:after="0"/>
+        <w:rPr>
+          <w:rFonts w:ascii="Times New Roman" w:hAnsi="Times New Roman" w:cs="Times New Roman"/>
+          <w:sz w:val="20"/>
+          <w:szCs w:val="20"/>
+        </w:rPr>
+      </w:pPr>
+      <w:r>
+        <w:rPr>
+          <w:rFonts w:ascii="Times New Roman" w:hAnsi="Times New Roman" w:cs="Times New Roman"/>
+          <w:sz w:val="20"/>
+          <w:szCs w:val="20"/>
+        </w:rPr>
+        <w:t>Embedded microcontroller coordination</w:t>
+      </w:r>
+    </w:p>
+    <w:p>
+      <w:pPr>
+        <w:spacing w:before="200" w:after="0"/>
+        <w:rPr>
+          <w:rFonts w:ascii="Times New Roman" w:hAnsi="Times New Roman" w:cs="Times New Roman"/>
+          <w:sz w:val="22"/>
+          <w:szCs w:val="22"/>
+        </w:rPr>
+      </w:pPr>
+      <w:r>
+        <w:rPr>
+          <w:rFonts w:ascii="Times New Roman" w:hAnsi="Times New Roman" w:cs="Times New Roman"/>
+          <w:sz w:val="22"/>
+          <w:szCs w:val="22"/>
+        </w:rPr>
+        <w:t>Control System</w:t>
+      </w:r>
+    </w:p>
+    <w:p>
+      <w:pPr>
+        <w:pStyle w:val="ListParagraph"/>
+        <w:numPr>
+          <w:ilvl w:val="0"/>
+          <w:numId w:val="2"/>
+        </w:numPr>
+        <w:spacing w:after="0"/>
+        <w:rPr>
+          <w:rFonts w:ascii="Times New Roman" w:hAnsi="Times New Roman" w:cs="Times New Roman"/>
+          <w:sz w:val="20"/>
+          <w:szCs w:val="20"/>
+        </w:rPr>
+      </w:pPr>
+      <w:r>
+        <w:rPr>
+          <w:rFonts w:ascii="Times New Roman" w:hAnsi="Times New Roman" w:cs="Times New Roman"/>
+          <w:sz w:val="20"/>
+          <w:szCs w:val="20"/>
+        </w:rPr>
+        <w:t>Real-time actuator command and feedback</w:t>
+      </w:r>
+    </w:p>
+    <w:p>
+      <w:pPr>
+        <w:pStyle w:val="ListParagraph"/>
+        <w:numPr>
+          <w:ilvl w:val="0"/>
+          <w:numId w:val="2"/>
+        </w:numPr>
+        <w:spacing w:before="240" w:after="0"/>
+        <w:rPr>
+          <w:rFonts w:ascii="Times New Roman" w:hAnsi="Times New Roman" w:cs="Times New Roman"/>
+          <w:sz w:val="20"/>
+          <w:szCs w:val="20"/>
+        </w:rPr>
+      </w:pPr>
+      <w:r>
+        <w:rPr>
+          <w:rFonts w:ascii="Times New Roman" w:hAnsi="Times New Roman" w:cs="Times New Roman"/>
+          <w:sz w:val="20"/>
+          <w:szCs w:val="20"/>
+        </w:rPr>
+        <w:t>Scalable firmware architecture</w:t>
+      </w:r>
+    </w:p>
+    <w:p>
+      <w:pPr>
+        <w:pStyle w:val="ListParagraph"/>
+        <w:numPr>
+          <w:ilvl w:val="0"/>
+          <w:numId w:val="2"/>
+        </w:numPr>
+        <w:spacing w:before="240" w:after="0"/>
+        <w:rPr>
+          <w:rFonts w:ascii="Times New Roman" w:hAnsi="Times New Roman" w:cs="Times New Roman"/>
+          <w:sz w:val="20"/>
+          <w:szCs w:val="20"/>
+        </w:rPr>
+      </w:pPr>
+      <w:r>
+        <w:rPr>
+          <w:rFonts w:ascii="Times New Roman" w:hAnsi="Times New Roman" w:cs="Times New Roman"/>
+          <w:sz w:val="20"/>
+          <w:szCs w:val="20"/>
+        </w:rPr>
+        <w:t>Expandable to autonomy stack integration</w:t>
+      </w:r>
+    </w:p>
+    <w:p>
+      <w:pPr>
+        <w:pBdr>
+          <w:bottom w:val="single" w:sz="6" w:space="1" w:color="auto"/>
+        </w:pBdr>
+        <w:spacing w:before="240" w:after="0"/>
+        <w:rPr>
+          <w:rFonts w:ascii="Times New Roman" w:hAnsi="Times New Roman" w:cs="Times New Roman"/>
+          <w:b/>
+          <w:bCs/>
+          <w:color w:val="156082" w:themeColor="accent1"/>
+          <w:sz w:val="28"/>
+          <w:szCs w:val="28"/>
+        </w:rPr>
+      </w:pPr>
+      <w:r>
+        <w:rPr>
+          <w:rFonts w:ascii="Times New Roman" w:hAnsi="Times New Roman" w:cs="Times New Roman"/>
+          <w:b/>
+          <w:bCs/>
+          <w:color w:val="156082" w:themeColor="accent1"/>
+          <w:sz w:val="28"/>
+          <w:szCs w:val="28"/>
+        </w:rPr>
+        <w:t>Images</w:t>
+      </w:r>
+    </w:p>
+    <w:p>
+      <w:pPr>
+        <w:spacing w:before="240" w:after="0"/>
+        <w:jc w:val="center"/>
+        <w:rPr>
+          <w:rStyle w:val="Heading1Char"/>
+          <w:rFonts w:ascii="Segoe UI" w:hAnsi="Segoe UI" w:cs="Segoe UI"/>
+          <w:sz w:val="18"/>
+          <w:szCs w:val="18"/>
+        </w:rPr>
+      </w:pPr>
+      <w:r>
+        <w:rPr>
+          <w:rFonts w:ascii="Segoe UI" w:eastAsiaTheme="majorEastAsia" w:hAnsi="Segoe UI" w:cs="Segoe UI"/>
+          <w:noProof/>
+          <w:color w:val="0F4761" w:themeColor="accent1" w:themeShade="BF"/>
+          <w:sz w:val="18"/>
+          <w:szCs w:val="18"/>
+        </w:rPr>
+        <w:drawing>
+          <wp:inline distT="0" distB="0" distL="0" distR="0" wp14:anchorId="18112554" wp14:editId="04C51F6C">
+            <wp:extent cx="1910343" cy="2174240"/>
+            <wp:effectExtent l="0" t="0" r="0" b="0"/>
+            <wp:docPr id="39397622" name="Picture 8" descr="A black and silver circular object&#10;&#10;AI-generated content may be incorrect."/>
+            <wp:cNvGraphicFramePr>
+              <a:graphicFrameLocks xmlns:a="http://schemas.openxmlformats.org/drawingml/2006/main" noChangeAspect="1"/>
+            </wp:cNvGraphicFramePr>
+            <a:graphic xmlns:a="http://schemas.openxmlformats.org/drawingml/2006/main">
+              <a:graphicData uri="http://schemas.openxmlformats.org/drawingml/2006/picture">
+                <pic:pic xmlns:pic="http://schemas.openxmlformats.org/drawingml/2006/picture">
+                  <pic:nvPicPr>
+                    <pic:cNvPr id="39397622" name="Picture 8" descr="A black and silver circular object&#10;&#10;AI-generated content may be incorrect."/>
+                    <pic:cNvPicPr/>
+                  </pic:nvPicPr>
+                  <pic:blipFill>
+                    <a:blip r:embed="rId5" cstate="print">
+                      <a:extLst>
+                        <a:ext uri="{28A0092B-C50C-407E-A947-70E740481C1C}">
+                          <a14:useLocalDpi xmlns:a14="http://schemas.microsoft.com/office/drawing/2010/main" val="0"/>
+                        </a:ext>
+                      </a:extLst>
+                    </a:blip>
+                    <a:stretch>
+                      <a:fillRect/>
+                    </a:stretch>
+                  </pic:blipFill>
+                  <pic:spPr>
+                    <a:xfrm>
+                      <a:off x="0" y="0"/>
+                      <a:ext cx="1959265" cy="2229920"/>
+                    </a:xfrm>
+                    <a:prstGeom prst="rect">
+                      <a:avLst/>
+                    </a:prstGeom>
+                  </pic:spPr>
+                </pic:pic>
+              </a:graphicData>
+            </a:graphic>
+          </wp:inline>
+        </w:drawing>
+      </w:r>
+      <w:r>
+        <w:rPr>
+          <w:rFonts w:ascii="Segoe UI" w:eastAsiaTheme="majorEastAsia" w:hAnsi="Segoe UI" w:cs="Segoe UI"/>
+          <w:noProof/>
+          <w:color w:val="0F4761" w:themeColor="accent1" w:themeShade="BF"/>
+          <w:sz w:val="18"/>
+          <w:szCs w:val="18"/>
+        </w:rPr>
+        <w:drawing>
+          <wp:inline distT="0" distB="0" distL="0" distR="0" wp14:anchorId="7CBE4A5C" wp14:editId="0D154A03">
+            <wp:extent cx="2130421" cy="2079664"/>
+            <wp:effectExtent l="0" t="318" r="3493" b="3492"/>
+            <wp:docPr id="1531290966" name="Picture 5" descr="A black and grey machine with green and black parts&#10;&#10;AI-generated content may be incorrect."/>
+            <wp:cNvGraphicFramePr>
+              <a:graphicFrameLocks xmlns:a="http://schemas.openxmlformats.org/drawingml/2006/main" noChangeAspect="1"/>
+            </wp:cNvGraphicFramePr>
+            <a:graphic xmlns:a="http://schemas.openxmlformats.org/drawingml/2006/main">
+              <a:graphicData uri="http://schemas.openxmlformats.org/drawingml/2006/picture">
+                <pic:pic xmlns:pic="http://schemas.openxmlformats.org/drawingml/2006/picture">
+                  <pic:nvPicPr>
+                    <pic:cNvPr id="1531290966" name="Picture 5" descr="A black and grey machine with green and black parts&#10;&#10;AI-generated content may be incorrect."/>
+                    <pic:cNvPicPr/>
+                  </pic:nvPicPr>
+                  <pic:blipFill>
+                    <a:blip r:embed="rId6" cstate="print">
+                      <a:extLst>
+                        <a:ext uri="{28A0092B-C50C-407E-A947-70E740481C1C}">
+                          <a14:useLocalDpi xmlns:a14="http://schemas.microsoft.com/office/drawing/2010/main" val="0"/>
+                        </a:ext>
+                      </a:extLst>
+                    </a:blip>
+                    <a:stretch>
+                      <a:fillRect/>
+                    </a:stretch>
+                  </pic:blipFill>
+                  <pic:spPr>
+                    <a:xfrm rot="5400000">
+                      <a:off x="0" y="0"/>
+                      <a:ext cx="2196229" cy="2143905"/>
+                    </a:xfrm>
+                    <a:prstGeom prst="rect">
+                      <a:avLst/>
+                    </a:prstGeom>
+                  </pic:spPr>
+                </pic:pic>
+              </a:graphicData>
+            </a:graphic>
+          </wp:inline>
+        </w:drawing>
+      </w:r>
+    </w:p>
+    <w:p>
+      <w:pPr>
+        <w:spacing w:before="240" w:after="0"/>
+        <w:rPr>
+          <w:rStyle w:val="Heading1Char"/>
+          <w:rFonts w:ascii="Segoe UI" w:hAnsi="Segoe UI" w:cs="Segoe UI"/>
+          <w:sz w:val="18"/>
+          <w:szCs w:val="18"/>
+        </w:rPr>
+      </w:pPr>
+    </w:p>
+    <w:p>
+      <w:pPr>
+        <w:spacing w:before="240" w:after="0"/>
+        <w:rPr>
+          <w:rFonts w:ascii="Times New Roman" w:hAnsi="Times New Roman" w:cs="Times New Roman"/>
+          <w:sz w:val="20"/>
+          <w:szCs w:val="20"/>
+        </w:rPr>
+      </w:pPr>
+    </w:p>
+    <w:p>
+      <w:pPr>
+        <w:pStyle w:val="paragraph"/>
+        <w:spacing w:before="0" w:beforeAutospacing="0" w:after="0" w:afterAutospacing="0"/>
+        <w:jc w:val="center"/>
+        <w:textAlignment w:val="baseline"/>
+        <w:rPr>
+          <w:rStyle w:val="normaltextrun"/>
+          <w:rFonts w:ascii="Aptos" w:eastAsiaTheme="majorEastAsia" w:hAnsi="Aptos" w:cs="Segoe UI"/>
+        </w:rPr>
+      </w:pPr>
+      <w:r>
+        <w:rPr>
+          <w:rFonts w:ascii="Aptos" w:eastAsiaTheme="majorEastAsia" w:hAnsi="Aptos" w:cs="Segoe UI"/>
+          <w:noProof/>
+          <w14:ligatures w14:val="standardContextual"/>
+        </w:rPr>
+        <w:drawing>
+          <wp:inline distT="0" distB="0" distL="0" distR="0" wp14:anchorId="296EA553" wp14:editId="3AF0C24E">
+            <wp:extent cx="3038785" cy="2430379"/>
+            <wp:effectExtent l="0" t="0" r="0" b="0"/>
+            <wp:docPr id="1456793907" name="Picture 6" descr="A black and silver robotic arm&#10;&#10;AI-generated content may be incorrect."/>
+            <wp:cNvGraphicFramePr>
+              <a:graphicFrameLocks xmlns:a="http://schemas.openxmlformats.org/drawingml/2006/main" noChangeAspect="1"/>
+            </wp:cNvGraphicFramePr>
+            <a:graphic xmlns:a="http://schemas.openxmlformats.org/drawingml/2006/main">
+              <a:graphicData uri="http://schemas.openxmlformats.org/drawingml/2006/picture">
+                <pic:pic xmlns:pic="http://schemas.openxmlformats.org/drawingml/2006/picture">
+                  <pic:nvPicPr>
+                    <pic:cNvPr id="1456793907" name="Picture 6" descr="A black and silver robotic arm&#10;&#10;AI-generated content may be incorrect."/>
+                    <pic:cNvPicPr/>
+                  </pic:nvPicPr>
+                  <pic:blipFill>
+                    <a:blip r:embed="rId7" cstate="print">
+                      <a:extLst>
+                        <a:ext uri="{28A0092B-C50C-407E-A947-70E740481C1C}">
+                          <a14:useLocalDpi xmlns:a14="http://schemas.microsoft.com/office/drawing/2010/main" val="0"/>
+                        </a:ext>
+                      </a:extLst>
+                    </a:blip>
+                    <a:stretch>
+                      <a:fillRect/>
+                    </a:stretch>
+                  </pic:blipFill>
+                  <pic:spPr>
+                    <a:xfrm>
+                      <a:off x="0" y="0"/>
+                      <a:ext cx="3057060" cy="2444995"/>
+                    </a:xfrm>
+                    <a:prstGeom prst="rect">
+                      <a:avLst/>
+                    </a:prstGeom>
+                  </pic:spPr>
+                </pic:pic>
+              </a:graphicData>
+            </a:graphic>
+          </wp:inline>
+        </w:drawing>
+      </w:r>
+      <w:r>
+        <w:rPr>
+          <w:rFonts w:ascii="Aptos" w:eastAsiaTheme="majorEastAsia" w:hAnsi="Aptos" w:cs="Segoe UI"/>
+          <w:noProof/>
+          <w14:ligatures w14:val="standardContextual"/>
+        </w:rPr>
+        <w:drawing>
+          <wp:inline distT="0" distB="0" distL="0" distR="0" wp14:anchorId="0F06B263" wp14:editId="11426386">
+            <wp:extent cx="2607834" cy="2430355"/>
+            <wp:effectExtent l="0" t="0" r="0" b="0"/>
+            <wp:docPr id="718629035" name="Picture 7" descr="A grey machine with a black handle&#10;&#10;AI-generated content may be incorrect."/>
+            <wp:cNvGraphicFramePr>
+              <a:graphicFrameLocks xmlns:a="http://schemas.openxmlformats.org/drawingml/2006/main" noChangeAspect="1"/>
+            </wp:cNvGraphicFramePr>
+            <a:graphic xmlns:a="http://schemas.openxmlformats.org/drawingml/2006/main">
+              <a:graphicData uri="http://schemas.openxmlformats.org/drawingml/2006/picture">
+                <pic:pic xmlns:pic="http://schemas.openxmlformats.org/drawingml/2006/picture">
+                  <pic:nvPicPr>
+                    <pic:cNvPr id="718629035" name="Picture 7" descr="A grey machine with a black handle&#10;&#10;AI-generated content may be incorrect."/>
+                    <pic:cNvPicPr/>
+                  </pic:nvPicPr>
+                  <pic:blipFill>
+                    <a:blip r:embed="rId8" cstate="print">
+                      <a:extLst>
+                        <a:ext uri="{28A0092B-C50C-407E-A947-70E740481C1C}">
+                          <a14:useLocalDpi xmlns:a14="http://schemas.microsoft.com/office/drawing/2010/main" val="0"/>
+                        </a:ext>
+                      </a:extLst>
+                    </a:blip>
+                    <a:stretch>
+                      <a:fillRect/>
+                    </a:stretch>
+                  </pic:blipFill>
+                  <pic:spPr>
+                    <a:xfrm>
+                      <a:off x="0" y="0"/>
+                      <a:ext cx="2653189" cy="2472623"/>
+                    </a:xfrm>
+                    <a:prstGeom prst="rect">
+                      <a:avLst/>
+                    </a:prstGeom>
+                  </pic:spPr>
+                </pic:pic>
+              </a:graphicData>
+            </a:graphic>
+          </wp:inline>
+        </w:drawing>
+      </w:r>
+    </w:p>
+    <w:p>
+      <w:pPr>
+        <w:pStyle w:val="paragraph"/>
+        <w:spacing w:before="0" w:beforeAutospacing="0" w:after="0" w:afterAutospacing="0"/>
+        <w:textAlignment w:val="baseline"/>
+        <w:rPr>
+          <w:rStyle w:val="normaltextrun"/>
+          <w:rFonts w:ascii="Aptos" w:eastAsiaTheme="majorEastAsia" w:hAnsi="Aptos" w:cs="Segoe UI"/>
+        </w:rPr>
+      </w:pPr>
+    </w:p>
+    <w:p>
+      <w:pPr>
+        <w:pStyle w:val="paragraph"/>
+        <w:spacing w:before="0" w:beforeAutospacing="0" w:after="0" w:afterAutospacing="0"/>
+        <w:textAlignment w:val="baseline"/>
+      </w:pPr>
+      <w:r>
+        <w:rPr>
+          <w:rStyle w:val="normaltextrun"/>
+          <w:rFonts w:eastAsiaTheme="majorEastAsia"/>
+        </w:rPr>
+        <w:t>Cycloidal Actuator in Motion</w:t>
+      </w:r>
+      <w:r>
+        <w:rPr>
+          <w:rStyle w:val="apple-converted-space"/>
+          <w:rFonts w:eastAsiaTheme="majorEastAsia"/>
+        </w:rPr>
+        <w:t> </w:t>
+      </w:r>
+      <w:proofErr w:type="gramStart"/>
+      <w:r>
+        <w:rPr>
+          <w:rStyle w:val="normaltextrun"/>
+          <w:rFonts w:eastAsiaTheme="majorEastAsia"/>
+        </w:rPr>
+        <w:t>Video(</w:t>
+      </w:r>
+      <w:proofErr w:type="gramEnd"/>
+      <w:r>
+        <w:rPr>
+          <w:rStyle w:val="normaltextrun"/>
+          <w:rFonts w:eastAsiaTheme="majorEastAsia"/>
+        </w:rPr>
+        <w:t>YouTube Link):</w:t>
+      </w:r>
+      <w:r>
+        <w:rPr>
+          <w:rStyle w:val="eop"/>
+          <w:rFonts w:eastAsiaTheme="majorEastAsia"/>
+        </w:rPr>
+        <w:t> </w:t>
+      </w:r>
+    </w:p>
+    <w:p>
+      <w:pPr>
+        <w:pStyle w:val="paragraph"/>
+        <w:spacing w:before="0" w:beforeAutospacing="0" w:after="0" w:afterAutospacing="0"/>
+        <w:textAlignment w:val="baseline"/>
+      </w:pPr>
+      <w:hyperlink r:id="rId9" w:tgtFrame="_blank" w:history="1">
+        <w:r>
+          <w:rPr>
+            <w:rStyle w:val="normaltextrun"/>
+            <w:rFonts w:eastAsiaTheme="majorEastAsia"/>
+            <w:color w:val="467886"/>
+            <w:u w:val="single"/>
+          </w:rPr>
+          <w:t>https://youtube.com/shorts/2TRJt4Sotoc</w:t>
+        </w:r>
+        <w:r>
+          <w:rPr>
+            <w:rStyle w:val="normaltextrun"/>
+            <w:rFonts w:eastAsiaTheme="majorEastAsia"/>
+            <w:color w:val="467886"/>
+            <w:u w:val="single"/>
+          </w:rPr>
+          <w:t>?</w:t>
+        </w:r>
+        <w:r>
+          <w:rPr>
+            <w:rStyle w:val="normaltextrun"/>
+            <w:rFonts w:eastAsiaTheme="majorEastAsia"/>
+            <w:color w:val="467886"/>
+            <w:u w:val="single"/>
+          </w:rPr>
+          <w:t>si=fDOp-mV0wug0be9X</w:t>
+        </w:r>
+      </w:hyperlink>
+      <w:r>
+        <w:rPr>
+          <w:rStyle w:val="eop"/>
+          <w:rFonts w:eastAsiaTheme="majorEastAsia"/>
+        </w:rPr>
+        <w:t> </w:t>
       </w:r>
     </w:p>
     <w:p>
@@ -3514,6 +4018,39 @@
       </w:tcPr>
     </w:tblStylePr>
   </w:style>
+  <w:style w:type="character" w:customStyle="1" w:styleId="wacimagecontainer">
+    <w:name w:val="wacimagecontainer"/>
+    <w:basedOn w:val="DefaultParagraphFont"/>
+    <w:rsid w:val="0007647C"/>
+  </w:style>
+  <w:style w:type="paragraph" w:customStyle="1" w:styleId="paragraph">
+    <w:name w:val="paragraph"/>
+    <w:basedOn w:val="Normal"/>
+    <w:rsid w:val="0007647C"/>
+    <w:pPr>
+      <w:spacing w:before="100" w:beforeAutospacing="1" w:after="100" w:afterAutospacing="1" w:line="240" w:lineRule="auto"/>
+    </w:pPr>
+    <w:rPr>
+      <w:rFonts w:ascii="Times New Roman" w:eastAsia="Times New Roman" w:hAnsi="Times New Roman" w:cs="Times New Roman"/>
+      <w:kern w:val="0"/>
+      <w14:ligatures w14:val="none"/>
+    </w:rPr>
+  </w:style>
+  <w:style w:type="character" w:customStyle="1" w:styleId="normaltextrun">
+    <w:name w:val="normaltextrun"/>
+    <w:basedOn w:val="DefaultParagraphFont"/>
+    <w:rsid w:val="0007647C"/>
+  </w:style>
+  <w:style w:type="character" w:customStyle="1" w:styleId="apple-converted-space">
+    <w:name w:val="apple-converted-space"/>
+    <w:basedOn w:val="DefaultParagraphFont"/>
+    <w:rsid w:val="0007647C"/>
+  </w:style>
+  <w:style w:type="character" w:customStyle="1" w:styleId="eop">
+    <w:name w:val="eop"/>
+    <w:basedOn w:val="DefaultParagraphFont"/>
+    <w:rsid w:val="0007647C"/>
+  </w:style>
 </w:styles>
 </file>
 

</xml_diff>

<commit_message>
updated the RFF and writing new grant document
</commit_message>
<xml_diff>
--- a/Purchasing/RFF/RFF - Quadruped Robot.docx
+++ b/Purchasing/RFF/RFF - Quadruped Robot.docx
@@ -1032,8 +1032,21 @@
           <w:sz w:val="20"/>
           <w:szCs w:val="20"/>
         </w:rPr>
-        <w:t>A full BOM can be provided upon request.</w:t>
-      </w:r>
+        <w:t xml:space="preserve">The full BOM can be found here: </w:t>
+      </w:r>
+      <w:hyperlink r:id="rId5" w:history="1">
+        <w:r>
+          <w:rPr>
+            <w:rStyle w:val="Hyperlink"/>
+            <w:rFonts w:ascii="Times New Roman" w:hAnsi="Times New Roman" w:cs="Times New Roman"/>
+            <w:i/>
+            <w:iCs/>
+            <w:sz w:val="20"/>
+            <w:szCs w:val="20"/>
+          </w:rPr>
+          <w:t>https://docs.google.com/spreadsheets/d/1iOrBElKn3ZWYgacHjj-oO1xYGCbOcYnV/edit?usp=sharing&amp;ouid=103966187593198360240&amp;rtpof=true&amp;sd=true</w:t>
+        </w:r>
+      </w:hyperlink>
     </w:p>
     <w:p>
       <w:pPr>
@@ -1824,7 +1837,7 @@
           <w:szCs w:val="18"/>
         </w:rPr>
         <w:drawing>
-          <wp:inline distT="0" distB="0" distL="0" distR="0" wp14:anchorId="18112554" wp14:editId="04C51F6C">
+          <wp:inline distT="0" distB="0" distL="0" distR="0" wp14:anchorId="18112554" wp14:editId="68657D65">
             <wp:extent cx="1910343" cy="2174240"/>
             <wp:effectExtent l="0" t="0" r="0" b="0"/>
             <wp:docPr id="39397622" name="Picture 8" descr="A black and silver circular object&#10;&#10;AI-generated content may be incorrect."/>
@@ -1839,7 +1852,7 @@
                     <pic:cNvPicPr/>
                   </pic:nvPicPr>
                   <pic:blipFill>
-                    <a:blip r:embed="rId5" cstate="print">
+                    <a:blip r:embed="rId6" cstate="print">
                       <a:extLst>
                         <a:ext uri="{28A0092B-C50C-407E-A947-70E740481C1C}">
                           <a14:useLocalDpi xmlns:a14="http://schemas.microsoft.com/office/drawing/2010/main" val="0"/>
@@ -1889,7 +1902,7 @@
                     <pic:cNvPicPr/>
                   </pic:nvPicPr>
                   <pic:blipFill>
-                    <a:blip r:embed="rId6" cstate="print">
+                    <a:blip r:embed="rId7" cstate="print">
                       <a:extLst>
                         <a:ext uri="{28A0092B-C50C-407E-A947-70E740481C1C}">
                           <a14:useLocalDpi xmlns:a14="http://schemas.microsoft.com/office/drawing/2010/main" val="0"/>
@@ -1970,7 +1983,7 @@
                     <pic:cNvPicPr/>
                   </pic:nvPicPr>
                   <pic:blipFill>
-                    <a:blip r:embed="rId7" cstate="print">
+                    <a:blip r:embed="rId8" cstate="print">
                       <a:extLst>
                         <a:ext uri="{28A0092B-C50C-407E-A947-70E740481C1C}">
                           <a14:useLocalDpi xmlns:a14="http://schemas.microsoft.com/office/drawing/2010/main" val="0"/>
@@ -2018,7 +2031,7 @@
                     <pic:cNvPicPr/>
                   </pic:nvPicPr>
                   <pic:blipFill>
-                    <a:blip r:embed="rId8" cstate="print">
+                    <a:blip r:embed="rId9" cstate="print">
                       <a:extLst>
                         <a:ext uri="{28A0092B-C50C-407E-A947-70E740481C1C}">
                           <a14:useLocalDpi xmlns:a14="http://schemas.microsoft.com/office/drawing/2010/main" val="0"/>
@@ -2106,7 +2119,7 @@
         <w:spacing w:before="0" w:beforeAutospacing="0" w:after="0" w:afterAutospacing="0"/>
         <w:textAlignment w:val="baseline"/>
       </w:pPr>
-      <w:hyperlink r:id="rId9" w:tgtFrame="_blank" w:history="1">
+      <w:hyperlink r:id="rId10" w:tgtFrame="_blank" w:history="1">
         <w:r>
           <w:rPr>
             <w:rStyle w:val="normaltextrun"/>
@@ -2114,25 +2127,7 @@
             <w:color w:val="467886"/>
             <w:u w:val="single"/>
           </w:rPr>
-          <w:t>https://youtube.com/shorts/2TRJt4Sotoc</w:t>
-        </w:r>
-        <w:r>
-          <w:rPr>
-            <w:rStyle w:val="normaltextrun"/>
-            <w:rFonts w:eastAsiaTheme="majorEastAsia"/>
-            <w:color w:val="467886"/>
-            <w:u w:val="single"/>
-          </w:rPr>
-          <w:t>?</w:t>
-        </w:r>
-        <w:r>
-          <w:rPr>
-            <w:rStyle w:val="normaltextrun"/>
-            <w:rFonts w:eastAsiaTheme="majorEastAsia"/>
-            <w:color w:val="467886"/>
-            <w:u w:val="single"/>
-          </w:rPr>
-          <w:t>si=fDOp-mV0wug0be9X</w:t>
+          <w:t>https://youtube.com/shorts/2TRJt4Sotoc?si=fDOp-mV0wug0be9X</w:t>
         </w:r>
       </w:hyperlink>
       <w:r>
@@ -4051,6 +4046,29 @@
     <w:basedOn w:val="DefaultParagraphFont"/>
     <w:rsid w:val="0007647C"/>
   </w:style>
+  <w:style w:type="character" w:styleId="Hyperlink">
+    <w:name w:val="Hyperlink"/>
+    <w:basedOn w:val="DefaultParagraphFont"/>
+    <w:uiPriority w:val="99"/>
+    <w:unhideWhenUsed/>
+    <w:rsid w:val="0015721F"/>
+    <w:rPr>
+      <w:color w:val="467886" w:themeColor="hyperlink"/>
+      <w:u w:val="single"/>
+    </w:rPr>
+  </w:style>
+  <w:style w:type="character" w:styleId="UnresolvedMention">
+    <w:name w:val="Unresolved Mention"/>
+    <w:basedOn w:val="DefaultParagraphFont"/>
+    <w:uiPriority w:val="99"/>
+    <w:semiHidden/>
+    <w:unhideWhenUsed/>
+    <w:rsid w:val="0015721F"/>
+    <w:rPr>
+      <w:color w:val="605E5C"/>
+      <w:shd w:val="clear" w:color="auto" w:fill="E1DFDD"/>
+    </w:rPr>
+  </w:style>
 </w:styles>
 </file>
 

</xml_diff>